<commit_message>
docs: build coursework document with chapters 1, 3, figures, and bibliography
- Generate master.md aggregating all chapters and content
- Update build scripts for DOCX assembly (build_docx.sh, build_master_md.py, make_reference_docx.py)
- Add Chapter 1 figures: triangular fuzzy number, centroid defuzzification, TOPSIS geometry, FAHP-TOPSIS-MC pipeline
- Add Chapter 3 figure: UI layout diagram
- Generate bibliography index (список джерел)
- Update reference.docx template
- Update course structure document with build process notes

Co-Authored-By: Claude Haiku 4.5 <noreply@anthropic.com>
</commit_message>
<xml_diff>
--- a/build/reference.docx
+++ b/build/reference.docx
@@ -382,7 +382,11 @@
 </w:t>
       </w:r>
     </w:p>
-    <w:sectPr/>
+    <w:sectPr>
+      <w:headerReference w:type="default" r:id="rId9"/>
+      <w:pgSz w:w="11906" w:h="16838"/>
+      <w:pgMar w:left="1417" w:right="850" w:top="1134" w:bottom="1134" w:header="567" w:footer="567"/>
+    </w:sectPr>
   </w:body>
 </w:document>
 </file>
@@ -427,6 +431,28 @@
     </w:p>
   </w:footnote>
 </w:footnotes>
+</file>
+
+<file path=word/header1.xml><?xml version="1.0" encoding="utf-8"?>
+<w:hdr xmlns:m="http://schemas.openxmlformats.org/officeDocument/2006/math" xmlns:mc="http://schemas.openxmlformats.org/markup-compatibility/2006" xmlns:mo="http://schemas.microsoft.com/office/mac/office/2008/main" xmlns:mv="urn:schemas-microsoft-com:mac:vml" xmlns:o="urn:schemas-microsoft-com:office:office" xmlns:r="http://schemas.openxmlformats.org/officeDocument/2006/relationships" xmlns:v="urn:schemas-microsoft-com:vml" xmlns:w10="urn:schemas-microsoft-com:office:word" xmlns:w14="http://schemas.microsoft.com/office/word/2010/wordml" xmlns:w="http://schemas.openxmlformats.org/wordprocessingml/2006/main" xmlns:wne="http://schemas.microsoft.com/office/word/2006/wordml" xmlns:wp14="http://schemas.microsoft.com/office/word/2010/wordprocessingDrawing" xmlns:wp="http://schemas.openxmlformats.org/drawingml/2006/wordprocessingDrawing" xmlns:wpc="http://schemas.microsoft.com/office/word/2010/wordprocessingCanvas" xmlns:wpg="http://schemas.microsoft.com/office/word/2010/wordprocessingGroup" xmlns:wpi="http://schemas.microsoft.com/office/word/2010/wordprocessingInk" xmlns:wps="http://schemas.microsoft.com/office/word/2010/wordprocessingShape" mc:Ignorable="w14 wp14">
+  <w:p>
+    <w:pPr>
+      <w:pStyle w:val="Header"/>
+      <w:jc w:val="right"/>
+    </w:pPr>
+    <w:r>
+      <w:rPr>
+        <w:rFonts w:ascii="Times New Roman Cyr" w:hAnsi="Times New Roman Cyr" w:cs="Times New Roman Cyr"/>
+        <w:sz w:val="28"/>
+        <w:szCs w:val="28"/>
+      </w:rPr>
+      <w:fldChar w:fldCharType="begin"/>
+      <w:instrText xml:space="preserve"> PAGE </w:instrText>
+      <w:fldChar w:fldCharType="separate"/>
+      <w:fldChar w:fldCharType="end"/>
+    </w:r>
+  </w:p>
+</w:hdr>
 </file>
 
 <file path=word/numbering.xml><?xml version="1.0" encoding="utf-8"?>
@@ -559,15 +585,15 @@
   </w:docDefaults>
   <w:latentStyles w:defLockedState="0" w:defUIPriority="0" w:defSemiHidden="0" w:defUnhideWhenUsed="0" w:defQFormat="0" w:count="276"/>
   <w:style w:type="paragraph" w:default="1" w:styleId="Normal">
+    <w:pPr>
+      <w:jc w:val="both"/>
+      <w:ind w:left="0" w:firstLine="71"/>
+      <w:spacing w:before="0" w:after="0" w:line="360" w:lineRule="auto"/>
+    </w:pPr>
     <w:name w:val="Normal"/>
     <w:qFormat/>
-    <w:pPr>
-      <w:spacing w:line="360" w:lineRule="auto"/>
-      <w:ind w:firstLine="720"/>
-      <w:jc w:val="both"/>
-    </w:pPr>
-    <w:rPr>
-      <w:rFonts w:ascii="Times New Roman" w:hAnsi="Times New Roman" w:cs="Times New Roman"/>
+    <w:rPr>
+      <w:rFonts w:ascii="Times New Roman Cyr" w:hAnsi="Times New Roman Cyr" w:cs="Times New Roman Cyr" w:eastAsia="Times New Roman Cyr"/>
       <w:sz w:val="28"/>
       <w:szCs w:val="28"/>
     </w:rPr>
@@ -589,16 +615,17 @@
   </w:style>
   <w:style w:type="paragraph" w:customStyle="1" w:styleId="Compact">
     <w:name w:val="Compact"/>
-    <w:basedOn w:val="Normal"/>
+    <w:basedOn w:val="BodyText"/>
     <w:qFormat/>
     <w:pPr>
       <w:spacing w:before="0" w:after="0" w:line="240" w:lineRule="auto"/>
-      <w:ind w:firstLine="0"/>
-      <w:jc w:val="left"/>
-    </w:pPr>
-    <w:rPr>
-      <w:rFonts w:ascii="Times New Roman" w:hAnsi="Times New Roman" w:cs="Times New Roman"/>
+      <w:jc w:val="both"/>
+      <w:ind w:left="0" w:firstLine="0"/>
+    </w:pPr>
+    <w:rPr>
+      <w:rFonts w:ascii="Times New Roman Cyr" w:hAnsi="Times New Roman Cyr" w:cs="Times New Roman Cyr" w:eastAsia="Times New Roman Cyr"/>
       <w:sz w:val="24"/>
+      <w:szCs w:val="24"/>
     </w:rPr>
   </w:style>
   <w:style w:type="paragraph" w:styleId="Title">
@@ -683,53 +710,72 @@
   <w:style w:type="paragraph" w:styleId="Heading1">
     <w:name w:val="Heading 1"/>
     <w:basedOn w:val="Normal"/>
-    <w:next w:val="Normal"/>
-    <w:qFormat/>
-    <w:pPr>
-      <w:spacing w:before="240" w:after="240" w:line="360" w:lineRule="auto"/>
-      <w:ind w:firstLine="0"/>
+    <w:next w:val="BodyText"/>
+    <w:uiPriority w:val="9"/>
+    <w:qFormat/>
+    <w:pPr>
+      <w:keepNext/>
+      <w:keepLines/>
+      <w:spacing w:before="0" w:after="240" w:line="360" w:lineRule="auto"/>
+      <w:outlineLvl w:val="0"/>
       <w:jc w:val="center"/>
-      <w:outlineLvl w:val="0"/>
-    </w:pPr>
-    <w:rPr>
-      <w:rFonts w:ascii="Times New Roman" w:hAnsi="Times New Roman" w:cs="Times New Roman"/>
+      <w:ind w:left="0" w:firstLine="0"/>
+      <w:pageBreakBefore/>
+    </w:pPr>
+    <w:rPr>
+      <w:rFonts w:asciiTheme="majorHAnsi" w:eastAsiaTheme="majorEastAsia" w:hAnsiTheme="majorHAnsi" w:cstheme="majorBidi" w:ascii="Times New Roman Cyr" w:hAnsi="Times New Roman Cyr" w:cs="Times New Roman Cyr" w:eastAsia="Times New Roman Cyr"/>
       <w:b/>
+      <w:bCs/>
+      <w:sz w:val="28"/>
+      <w:szCs w:val="28"/>
       <w:caps/>
-      <w:sz w:val="28"/>
     </w:rPr>
   </w:style>
   <w:style w:type="paragraph" w:styleId="Heading2">
     <w:name w:val="Heading 2"/>
     <w:basedOn w:val="Normal"/>
-    <w:next w:val="Normal"/>
-    <w:qFormat/>
-    <w:pPr>
-      <w:spacing w:before="180" w:after="120" w:line="360" w:lineRule="auto"/>
-      <w:ind w:firstLine="720"/>
-      <w:jc w:val="left"/>
+    <w:next w:val="BodyText"/>
+    <w:uiPriority w:val="9"/>
+    <w:unhideWhenUsed/>
+    <w:qFormat/>
+    <w:pPr>
+      <w:keepNext/>
+      <w:keepLines/>
+      <w:spacing w:before="720" w:after="480" w:line="360" w:lineRule="auto"/>
       <w:outlineLvl w:val="1"/>
-    </w:pPr>
-    <w:rPr>
-      <w:rFonts w:ascii="Times New Roman" w:hAnsi="Times New Roman" w:cs="Times New Roman"/>
+      <w:jc w:val="both"/>
+      <w:ind w:left="0" w:firstLine="71"/>
+      <w:pageBreakBefore/>
+    </w:pPr>
+    <w:rPr>
+      <w:rFonts w:asciiTheme="majorHAnsi" w:eastAsiaTheme="majorEastAsia" w:hAnsiTheme="majorHAnsi" w:cstheme="majorBidi" w:ascii="Times New Roman Cyr" w:hAnsi="Times New Roman Cyr" w:cs="Times New Roman Cyr" w:eastAsia="Times New Roman Cyr"/>
       <w:b/>
+      <w:bCs/>
       <w:sz w:val="28"/>
+      <w:szCs w:val="28"/>
     </w:rPr>
   </w:style>
   <w:style w:type="paragraph" w:styleId="Heading3">
     <w:name w:val="Heading 3"/>
     <w:basedOn w:val="Normal"/>
-    <w:next w:val="Normal"/>
-    <w:qFormat/>
-    <w:pPr>
-      <w:spacing w:before="120" w:after="60" w:line="360" w:lineRule="auto"/>
-      <w:ind w:firstLine="720"/>
-      <w:jc w:val="left"/>
+    <w:next w:val="BodyText"/>
+    <w:uiPriority w:val="9"/>
+    <w:unhideWhenUsed/>
+    <w:qFormat/>
+    <w:pPr>
+      <w:keepNext/>
+      <w:keepLines/>
+      <w:spacing w:before="480" w:after="240" w:line="360" w:lineRule="auto"/>
       <w:outlineLvl w:val="2"/>
-    </w:pPr>
-    <w:rPr>
-      <w:rFonts w:ascii="Times New Roman" w:hAnsi="Times New Roman" w:cs="Times New Roman"/>
+      <w:jc w:val="both"/>
+      <w:ind w:left="0" w:firstLine="71"/>
+    </w:pPr>
+    <w:rPr>
+      <w:rFonts w:asciiTheme="majorHAnsi" w:eastAsiaTheme="majorEastAsia" w:hAnsiTheme="majorHAnsi" w:cstheme="majorBidi" w:ascii="Times New Roman Cyr" w:hAnsi="Times New Roman Cyr" w:cs="Times New Roman Cyr" w:eastAsia="Times New Roman Cyr"/>
       <w:b/>
+      <w:bCs/>
       <w:sz w:val="28"/>
+      <w:szCs w:val="28"/>
     </w:rPr>
   </w:style>
   <w:style w:type="paragraph" w:styleId="Heading4">
@@ -883,21 +929,15 @@
   <w:style w:type="table" w:default="1" w:styleId="Table">
     <w:name w:val="Table"/>
     <w:basedOn w:val="TableNormal"/>
+    <w:semiHidden/>
+    <w:unhideWhenUsed/>
     <w:qFormat/>
     <w:tblPr>
       <w:tblInd w:w="0" w:type="dxa"/>
-      <w:tblBorders>
-        <w:top w:val="single" w:sz="4" w:space="0" w:color="000000"/>
-        <w:left w:val="single" w:sz="4" w:space="0" w:color="000000"/>
-        <w:bottom w:val="single" w:sz="4" w:space="0" w:color="000000"/>
-        <w:right w:val="single" w:sz="4" w:space="0" w:color="000000"/>
-        <w:insideH w:val="single" w:sz="4" w:space="0" w:color="000000"/>
-        <w:insideV w:val="single" w:sz="4" w:space="0" w:color="000000"/>
-      </w:tblBorders>
       <w:tblCellMar>
-        <w:top w:w="60" w:type="dxa"/>
+        <w:top w:w="0" w:type="dxa"/>
         <w:left w:w="108" w:type="dxa"/>
-        <w:bottom w:w="60" w:type="dxa"/>
+        <w:bottom w:w="0" w:type="dxa"/>
         <w:right w:w="108" w:type="dxa"/>
       </w:tblCellMar>
     </w:tblPr>
@@ -924,10 +964,14 @@
     <w:basedOn w:val="Normal"/>
     <w:link w:val="BodyTextChar"/>
     <w:pPr>
-      <w:spacing w:before="0" w:after="120"/>
-    </w:pPr>
-    <w:rPr>
-      <w:i/>
+      <w:spacing w:before="120" w:after="120" w:line="360" w:lineRule="auto"/>
+      <w:jc w:val="center"/>
+      <w:ind w:left="0" w:firstLine="0"/>
+    </w:pPr>
+    <w:rPr>
+      <w:rFonts w:ascii="Times New Roman Cyr" w:hAnsi="Times New Roman Cyr" w:cs="Times New Roman Cyr" w:eastAsia="Times New Roman Cyr"/>
+      <w:sz w:val="28"/>
+      <w:szCs w:val="28"/>
     </w:rPr>
   </w:style>
   <w:style w:type="paragraph" w:customStyle="1" w:styleId="TableCaption">
@@ -942,8 +986,18 @@
     <w:basedOn w:val="Caption"/>
   </w:style>
   <w:style w:type="paragraph" w:customStyle="1" w:styleId="Figure">
+    <w:pPr>
+      <w:jc w:val="center"/>
+      <w:ind w:left="0" w:firstLine="0"/>
+      <w:spacing w:before="120" w:after="0" w:line="360" w:lineRule="auto"/>
+    </w:pPr>
     <w:name w:val="Figure"/>
     <w:basedOn w:val="Normal"/>
+    <w:rPr>
+      <w:rFonts w:ascii="Times New Roman Cyr" w:hAnsi="Times New Roman Cyr" w:cs="Times New Roman Cyr" w:eastAsia="Times New Roman Cyr"/>
+      <w:sz w:val="28"/>
+      <w:szCs w:val="28"/>
+    </w:rPr>
   </w:style>
   <w:style w:type="paragraph" w:customStyle="1" w:styleId="CaptionedFigure">
     <w:name w:val="Captioned Figure"/>
@@ -995,6 +1049,32 @@
       <w:b w:val="0"/>
       <w:bCs w:val="0"/>
       <w:color w:val="365F91" w:themeColor="accent1" w:themeShade="BF"/>
+    </w:rPr>
+  </w:style>
+  <w:style w:type="paragraph" w:customStyle="1" w:styleId="TableParagraph">
+    <w:pPr>
+      <w:jc w:val="both"/>
+      <w:ind w:left="0" w:firstLine="0"/>
+      <w:spacing w:before="0" w:after="0" w:line="240" w:lineRule="auto"/>
+    </w:pPr>
+    <w:name w:val="Table Paragraph"/>
+    <w:rPr>
+      <w:rFonts w:ascii="Times New Roman Cyr" w:hAnsi="Times New Roman Cyr" w:cs="Times New Roman Cyr" w:eastAsia="Times New Roman Cyr"/>
+      <w:sz w:val="24"/>
+      <w:szCs w:val="24"/>
+    </w:rPr>
+  </w:style>
+  <w:style w:type="paragraph" w:customStyle="1" w:styleId="TableCaption">
+    <w:pPr>
+      <w:jc w:val="both"/>
+      <w:ind w:left="0" w:firstLine="0"/>
+      <w:spacing w:before="120" w:after="0" w:line="360" w:lineRule="auto"/>
+    </w:pPr>
+    <w:name w:val="TableCaption"/>
+    <w:rPr>
+      <w:rFonts w:ascii="Times New Roman Cyr" w:hAnsi="Times New Roman Cyr" w:cs="Times New Roman Cyr" w:eastAsia="Times New Roman Cyr"/>
+      <w:sz w:val="28"/>
+      <w:szCs w:val="28"/>
     </w:rPr>
   </w:style>
 </w:styles>

</xml_diff>